<commit_message>
added depolyment note to front page
</commit_message>
<xml_diff>
--- a/ArenaSync_Final_Project_Report.docx
+++ b/ArenaSync_Final_Project_Report.docx
@@ -549,6 +549,29 @@
                 <w:sz w:val="22"/>
               </w:rPr>
               <w:t>Admin: admin@arenasync.com / Admin123!    Manager: manager@arenasync.com / Manager123!    Viewer: viewer@arenasync.com / Viewer123!</w:t>
+            </w:r>
+          </w:p>
+          <w:p>
+            <w:pPr>
+              <w:spacing w:before="120" w:after="0" w:line="276" w:lineRule="auto"/>
+            </w:pPr>
+            <w:r>
+              <w:rPr>
+                <w:rFonts w:ascii="Aptos" w:hAnsi="Aptos"/>
+                <w:b/>
+                <w:color w:val="08325C"/>
+                <w:sz w:val="21"/>
+              </w:rPr>
+              <w:t xml:space="preserve">First launch note: </w:t>
+            </w:r>
+            <w:r>
+              <w:rPr>
+                <w:rFonts w:ascii="Aptos" w:hAnsi="Aptos"/>
+                <w:b w:val="0"/>
+                <w:color w:val="08325C"/>
+                <w:sz w:val="21"/>
+              </w:rPr>
+              <w:t>Because ArenaSync is hosted on Azure App Service with Azure SQL, the first visit after the site has been idle may take 30-90 seconds while the app server and database server wake up. Please give the site a moment to launch; if the first page shows a temporary error, refresh once after a short wait.</w:t>
             </w:r>
           </w:p>
         </w:tc>
@@ -12059,6 +12082,11 @@
         </w:tc>
       </w:tr>
     </w:tbl>
+    <w:p>
+      <w:r>
+        <w:br w:type="page"/>
+      </w:r>
+    </w:p>
     <w:p>
       <w:pPr>
         <w:pStyle w:val="Heading2"/>

</xml_diff>